<commit_message>
fix: fix CV Format N field positions and age calculation from DOB
- Move NAME/CONTACT NO/NATIONALITY labels to invisible cells so values
  fill their original positions (cell 2 for name/phone, cell 1 for nationality)
- Clear all hardcoded sample values (26, Housemaid, 55kg, 155cm, etc.)
  so missing candidate data renders as blank
- Compute age from date of birth when age field is not set

Co-Authored-By: Claude Sonnet 4.6 <noreply@anthropic.com>
</commit_message>
<xml_diff>
--- a/cv/cv format n.docx
+++ b/cv/cv format n.docx
@@ -253,6 +253,12 @@
                 <w:u w:val="single"/>
               </w:rPr>
             </w:pPr>
+            <w:r>
+              <w:rPr>
+                <w:color w:val="FFFFFF"/>
+              </w:rPr>
+              <w:t>NAME</w:t>
+            </w:r>
           </w:p>
         </w:tc>
         <w:tc>
@@ -279,7 +285,7 @@
                 <w:sz w:val="26"/>
                 <w:szCs w:val="26"/>
               </w:rPr>
-              <w:t>NAME</w:t>
+              <w:t/>
             </w:r>
           </w:p>
         </w:tc>
@@ -424,7 +430,7 @@
               </w:rPr>
             </w:pPr>
             <w:r>
-              <w:t>26</w:t>
+              <w:t/>
             </w:r>
           </w:p>
         </w:tc>
@@ -569,7 +575,7 @@
                 <w:sz w:val="20"/>
                 <w:szCs w:val="20"/>
               </w:rPr>
-              <w:t>30/8/1999</w:t>
+              <w:t/>
             </w:r>
           </w:p>
         </w:tc>
@@ -845,7 +851,7 @@
                 <w:sz w:val="20"/>
                 <w:szCs w:val="20"/>
               </w:rPr>
-              <w:t xml:space="preserve">Housemaid </w:t>
+              <w:t/>
             </w:r>
           </w:p>
         </w:tc>
@@ -878,7 +884,7 @@
                 <w:szCs w:val="20"/>
                 <w:rtl/>
               </w:rPr>
-              <w:t>عاملة منزلية</w:t>
+              <w:t/>
             </w:r>
           </w:p>
         </w:tc>
@@ -1020,7 +1026,7 @@
                 <w:sz w:val="20"/>
                 <w:szCs w:val="20"/>
               </w:rPr>
-              <w:t>First time</w:t>
+              <w:t/>
             </w:r>
           </w:p>
         </w:tc>
@@ -1053,7 +1059,7 @@
                 <w:szCs w:val="20"/>
                 <w:rtl/>
               </w:rPr>
-              <w:t>لم يسبق لها العمل</w:t>
+              <w:t/>
             </w:r>
           </w:p>
         </w:tc>
@@ -1195,7 +1201,7 @@
                 <w:sz w:val="20"/>
                 <w:szCs w:val="20"/>
               </w:rPr>
-              <w:t xml:space="preserve">Good  </w:t>
+              <w:t/>
             </w:r>
           </w:p>
         </w:tc>
@@ -1227,7 +1233,7 @@
                 <w:sz w:val="20"/>
                 <w:szCs w:val="20"/>
               </w:rPr>
-              <w:t xml:space="preserve">- </w:t>
+              <w:t/>
             </w:r>
           </w:p>
         </w:tc>
@@ -1369,7 +1375,7 @@
                 <w:sz w:val="20"/>
                 <w:szCs w:val="20"/>
               </w:rPr>
-              <w:t xml:space="preserve">Muslim  </w:t>
+              <w:t/>
             </w:r>
           </w:p>
         </w:tc>
@@ -1402,7 +1408,7 @@
                 <w:szCs w:val="20"/>
                 <w:rtl/>
               </w:rPr>
-              <w:t>مسلمة</w:t>
+              <w:t/>
             </w:r>
           </w:p>
         </w:tc>
@@ -1543,7 +1549,7 @@
                 <w:sz w:val="18"/>
                 <w:szCs w:val="18"/>
               </w:rPr>
-              <w:t xml:space="preserve">Primary  </w:t>
+              <w:t/>
             </w:r>
           </w:p>
         </w:tc>
@@ -1576,16 +1582,7 @@
                 <w:szCs w:val="20"/>
                 <w:rtl/>
               </w:rPr>
-              <w:t>إبتدائي</w:t>
-            </w:r>
-            <w:r>
-              <w:rPr>
-                <w:rFonts w:ascii="Dubai" w:eastAsia="Dubai" w:hAnsi="Dubai" w:cs="Dubai"/>
-                <w:color w:val="074F6A"/>
-                <w:sz w:val="20"/>
-                <w:szCs w:val="20"/>
-              </w:rPr>
-              <w:t xml:space="preserve">   </w:t>
+              <w:t/>
             </w:r>
           </w:p>
         </w:tc>
@@ -1859,7 +1856,7 @@
                 <w:sz w:val="20"/>
                 <w:szCs w:val="20"/>
               </w:rPr>
-              <w:t xml:space="preserve">                 Married </w:t>
+              <w:t/>
             </w:r>
           </w:p>
         </w:tc>
@@ -1892,7 +1889,7 @@
                 <w:szCs w:val="20"/>
                 <w:rtl/>
               </w:rPr>
-              <w:t>متزوجة</w:t>
+              <w:t/>
             </w:r>
           </w:p>
         </w:tc>
@@ -2034,7 +2031,7 @@
                 <w:sz w:val="20"/>
                 <w:szCs w:val="20"/>
               </w:rPr>
-              <w:t>2</w:t>
+              <w:t/>
             </w:r>
           </w:p>
         </w:tc>
@@ -2176,7 +2173,7 @@
                 <w:sz w:val="20"/>
                 <w:szCs w:val="20"/>
               </w:rPr>
-              <w:t>55</w:t>
+              <w:t/>
             </w:r>
           </w:p>
         </w:tc>
@@ -2317,7 +2314,7 @@
                 <w:sz w:val="20"/>
                 <w:szCs w:val="20"/>
               </w:rPr>
-              <w:t>155</w:t>
+              <w:t/>
             </w:r>
           </w:p>
         </w:tc>
@@ -3594,6 +3591,12 @@
                 <w:szCs w:val="16"/>
               </w:rPr>
             </w:pPr>
+            <w:r>
+              <w:rPr>
+                <w:color w:val="FFFFFF"/>
+              </w:rPr>
+              <w:t>CONTACT NO</w:t>
+            </w:r>
           </w:p>
         </w:tc>
         <w:tc>
@@ -3613,15 +3616,6 @@
                 <w:szCs w:val="20"/>
               </w:rPr>
             </w:pPr>
-            <w:r>
-              <w:t xml:space="preserve"> </w:t>
-            </w:r>
-            <w:r>
-              <w:rPr>
-                <w:color w:val="444440"/>
-              </w:rPr>
-              <w:t>CONTACT NO</w:t>
-            </w:r>
           </w:p>
         </w:tc>
         <w:tc>
@@ -3758,6 +3752,12 @@
                 <w:szCs w:val="22"/>
               </w:rPr>
             </w:pPr>
+            <w:r>
+              <w:rPr>
+                <w:color w:val="FFFFFF"/>
+              </w:rPr>
+              <w:t>NATIONALITY</w:t>
+            </w:r>
           </w:p>
         </w:tc>
       </w:tr>
@@ -3794,7 +3794,7 @@
                 <w:sz w:val="22"/>
                 <w:szCs w:val="22"/>
               </w:rPr>
-              <w:t>NATIONALITY</w:t>
+              <w:t/>
             </w:r>
           </w:p>
         </w:tc>

</xml_diff>